<commit_message>
update protocols add instruction video for station 2 slippage merge stimulus code for stations 1 and 2 added metronome to et_sync and slippage tasks updated slippage tasks added videos to slippage task instruction screens
</commit_message>
<xml_diff>
--- a/Protocol_station1.docx
+++ b/Protocol_station1.docx
@@ -130,15 +130,7 @@
         <w:t>, refresh rate: 60 Hz)</w:t>
       </w:r>
       <w:r>
-        <w:t xml:space="preserve"> at a viewing distance of 63 cm using </w:t>
-      </w:r>
-      <w:proofErr w:type="spellStart"/>
-      <w:r>
-        <w:t>PsychoPy</w:t>
-      </w:r>
-      <w:proofErr w:type="spellEnd"/>
-      <w:r>
-        <w:t xml:space="preserve"> (v. </w:t>
+        <w:t xml:space="preserve"> at a viewing distance of 63 cm using PsychoPy (v. </w:t>
       </w:r>
       <w:r>
         <w:t>2023.2.3</w:t>
@@ -330,10 +322,7 @@
           <w:p>
             <w:r>
               <w:lastRenderedPageBreak/>
-              <w:t xml:space="preserve">Each eye tracker may have specific </w:t>
-            </w:r>
-            <w:r>
-              <w:t xml:space="preserve">set up requirements. Below </w:t>
+              <w:t xml:space="preserve">Each eye tracker may have specific set up requirements. Below </w:t>
             </w:r>
             <w:r>
               <w:t xml:space="preserve">are </w:t>
@@ -900,26 +889,7 @@
     </w:p>
     <w:p>
       <w:r>
-        <w:t xml:space="preserve">The Tobii Pro Glasses 3 is set up and calibrated in accordance with the instructions in sections 8.1, 8.2, and 8.4.2 of the Tobii Pro Glasses 3 user </w:t>
-      </w:r>
-      <w:proofErr w:type="gramStart"/>
-      <w:r>
-        <w:t>manual</w:t>
-      </w:r>
-      <w:proofErr w:type="gramEnd"/>
-      <w:r>
-        <w:t xml:space="preserve"> (v. 1.20). Since the physical calibration marker is not clearly visible in the scene camera when held against the screen, a calibration marker is added to the </w:t>
-      </w:r>
-      <w:proofErr w:type="spellStart"/>
-      <w:r>
-        <w:t>PsychoPy</w:t>
-      </w:r>
-      <w:proofErr w:type="spellEnd"/>
-      <w:r>
-        <w:t xml:space="preserve"> script for recordings with the Tobii. To show the calibration marker on the screen, press ‘t’ on the keyboard when the validation screen is shown (</w:t>
-      </w:r>
-      <w:r>
-        <w:t>and ‘t’ to return to the validation screen after calibration is completed). Recordings are performed at 50 Hz, as the 100 Hz mode has known data quality issues (Niehorster et al., 2020).</w:t>
+        <w:t>The Tobii Pro Glasses 3 is set up and calibrated in accordance with the instructions in sections 8.1, 8.2, and 8.4.2 of the Tobii Pro Glasses 3 user manual (v. 1.20). Since the physical calibration marker is not clearly visible in the scene camera when held against the screen, a calibration marker is added to the PsychoPy script for recordings with the Tobii. To show the calibration marker on the screen, press ‘t’ on the keyboard when the validation screen is shown (and ‘t’ to return to the validation screen after calibration is completed). Recordings are performed at 50 Hz, as the 100 Hz mode has known data quality issues (Niehorster et al., 2020).</w:t>
       </w:r>
     </w:p>
     <w:p>
@@ -1195,7 +1165,16 @@
         <w:t xml:space="preserve">(0.5 Hz) </w:t>
       </w:r>
       <w:r>
-        <w:t>side-to-side.</w:t>
+        <w:t>side-to-side</w:t>
+      </w:r>
+      <w:r>
+        <w:t>, following a metronome that indicates the head movement frequency</w:t>
+      </w:r>
+      <w:r>
+        <w:t>.</w:t>
+      </w:r>
+      <w:r>
+        <w:t xml:space="preserve"> Rotate the head by about 15 degrees each way.</w:t>
       </w:r>
     </w:p>
     <w:p>
@@ -1417,15 +1396,7 @@
         <w:t xml:space="preserve"> </w:t>
       </w:r>
       <w:r>
-        <w:t>White placeholder circles (1 deg diameter) are placed at the location of all targets. The location of the next target is cued with a red circle (0.7 deg diameter</w:t>
-      </w:r>
-      <w:proofErr w:type="gramStart"/>
-      <w:r>
-        <w:t>)</w:t>
-      </w:r>
-      <w:proofErr w:type="gramEnd"/>
-      <w:r>
-        <w:t xml:space="preserve"> and the fixation target is smoothly animated between fixation target locations. Once it arrives at the upcoming fixation location it decreases in diameter from 1.5 deg to 0.7 during 0.4 s, after which it stays at the small size for 1 s. The data during this </w:t>
+        <w:t xml:space="preserve">White placeholder circles (1 deg diameter) are placed at the location of all targets. The location of the next target is cued with a red circle (0.7 deg diameter) and the fixation target is smoothly animated between fixation target locations. Once it arrives at the upcoming fixation location it decreases in diameter from 1.5 deg to 0.7 during 0.4 s, after which it stays at the small size for 1 s. The data during this </w:t>
       </w:r>
       <w:r>
         <w:t>0.4</w:t>
@@ -1500,7 +1471,7 @@
         </w:rPr>
         <w:lastRenderedPageBreak/>
         <w:drawing>
-          <wp:inline distT="0" distB="0" distL="0" distR="0" wp14:anchorId="44A07405" wp14:editId="1210A2E3">
+          <wp:inline distT="0" distB="0" distL="0" distR="0" wp14:anchorId="44A07405" wp14:editId="48D99207">
             <wp:extent cx="5758815" cy="3238500"/>
             <wp:effectExtent l="0" t="0" r="0" b="0"/>
             <wp:docPr id="81156558" name="Picture 4"/>
@@ -2071,15 +2042,7 @@
         <w:t xml:space="preserve"> If required, a short version of the experiment is run for participants to familiarize themselves with the tasks.</w:t>
       </w:r>
       <w:r>
-        <w:t xml:space="preserve"> Second, an eye tracker is fitted to the </w:t>
-      </w:r>
-      <w:proofErr w:type="gramStart"/>
-      <w:r>
-        <w:t>participant</w:t>
-      </w:r>
-      <w:proofErr w:type="gramEnd"/>
-      <w:r>
-        <w:t xml:space="preserve"> and a calibration is performed followed by a visual check of the calibration accuracy (see </w:t>
+        <w:t xml:space="preserve"> Second, an eye tracker is fitted to the participant and a calibration is performed followed by a visual check of the calibration accuracy (see </w:t>
       </w:r>
       <w:r>
         <w:t>below</w:t>
@@ -2088,15 +2051,7 @@
         <w:t xml:space="preserve">). Participants are asked to </w:t>
       </w:r>
       <w:r>
-        <w:t>place their heads on the chinrest and remain seated in the same position throughout the tasks (</w:t>
-      </w:r>
-      <w:proofErr w:type="gramStart"/>
-      <w:r>
-        <w:t>with the exception of</w:t>
-      </w:r>
-      <w:proofErr w:type="gramEnd"/>
-      <w:r>
-        <w:t xml:space="preserve"> the VOR-sync).</w:t>
+        <w:t>place their heads on the chinrest and remain seated in the same position throughout the tasks (with the exception of the VOR-sync).</w:t>
       </w:r>
     </w:p>
     <w:p>
@@ -2124,15 +2079,7 @@
         <w:t xml:space="preserve">ere fixation targets enclosed in a circle with a radius of 3 degrees are presented at five different locations (the center, +- 15 degrees horizontally, and +-10 degrees vertically). If the operator judges (e.g. using the live gaze view of the eye tracker) that the gaze is within the circles in all five locations, the recording is allowed to start. Otherwise, the calibration procedure is repeated to try to achieve higher accuracy. If the accuracy check fails after three calibrations, the recording is started </w:t>
       </w:r>
       <w:r>
-        <w:t xml:space="preserve">anyways. The operator takes </w:t>
-      </w:r>
-      <w:proofErr w:type="gramStart"/>
-      <w:r>
-        <w:t>a note</w:t>
-      </w:r>
-      <w:proofErr w:type="gramEnd"/>
-      <w:r>
-        <w:t xml:space="preserve"> of how many calibration attempts (1, 2, 3, or failed) were needed to reach the accuracy criterion, and the total calibration time in seconds.</w:t>
+        <w:t>anyways. The operator takes a note of how many calibration attempts (1, 2, 3, or failed) were needed to reach the accuracy criterion, and the total calibration time in seconds.</w:t>
       </w:r>
     </w:p>
     <w:p>
@@ -2148,15 +2095,7 @@
     </w:p>
     <w:p>
       <w:r>
-        <w:t xml:space="preserve">Participants are asked to </w:t>
-      </w:r>
-      <w:proofErr w:type="gramStart"/>
-      <w:r>
-        <w:t>fixate</w:t>
-      </w:r>
-      <w:proofErr w:type="gramEnd"/>
-      <w:r>
-        <w:t xml:space="preserve"> a target in the center of the screen while slowly moving the head side-to-side</w:t>
+        <w:t>Participants are asked to fixate a target in the center of the screen while slowly moving the head side-to-side</w:t>
       </w:r>
       <w:r>
         <w:t xml:space="preserve"> (see Hooge et al, 2022)</w:t>
@@ -2177,73 +2116,55 @@
           <w:i/>
           <w:iCs/>
         </w:rPr>
-        <w:t xml:space="preserve">“A black-and-white fixation target will appear on top of a grey circle. Carefully look at the center of this fixation target. After a while, the grey background circle will turn red. When the circle is red, slowly and continuously move your head side to side (like shaking "no") five times while you keep looking at the center of the fixation target. When the background circle turns grey again, stop moving your head but keep looking at the fixation </w:t>
-      </w:r>
-      <w:proofErr w:type="gramStart"/>
+        <w:t>“A black-and-white fixation target will appear on top of a grey circle. Carefully look at the center of this fixation target. After a while, the grey background circle will turn red. When the circle is red, slowly and continuously move your head side to side (like shaking "no") five times while you keep looking at the center of the fixation target. When the background circle turns grey again, stop moving your head but keep looking at the fixation target.”</w:t>
+      </w:r>
+    </w:p>
+    <w:p>
+      <w:pPr>
+        <w:pStyle w:val="Heading4"/>
+      </w:pPr>
+      <w:r>
+        <w:t>Task 2 – Fixating multiple targets one-by-one at different locations on a gray background</w:t>
+      </w:r>
+    </w:p>
+    <w:p>
+      <w:r>
+        <w:t>The participant is asked to place the head in the chinrest and to keep the head as still as possible during the recording. The head/chinrest position is adjusted such that the whole stimulus is visible in the scene camera of the eye tracker.</w:t>
+      </w:r>
+      <w:r>
+        <w:t xml:space="preserve"> If it is not possible to have the whole stimulus visible in the scene camera, the participant is positioned such that the center target is approximately in the center of the scene camera’s image.</w:t>
+      </w:r>
+    </w:p>
+    <w:p>
+      <w:r>
+        <w:lastRenderedPageBreak/>
+        <w:t>Fixation targets are then presented one at the time in random order</w:t>
+      </w:r>
+      <w:r>
+        <w:t>. To help participants locate the next target, fixation targets are moved smoothly between locations, and the next target location is cued with a red circle.</w:t>
+      </w:r>
+      <w:r>
+        <w:t xml:space="preserve"> Participants are instructed as follows:</w:t>
+      </w:r>
+    </w:p>
+    <w:p>
+      <w:r>
+        <w:t>“</w:t>
+      </w:r>
       <w:r>
         <w:rPr>
           <w:i/>
           <w:iCs/>
         </w:rPr>
-        <w:t>target.”</w:t>
-      </w:r>
-      <w:proofErr w:type="gramEnd"/>
-    </w:p>
-    <w:p>
-      <w:pPr>
-        <w:pStyle w:val="Heading4"/>
-      </w:pPr>
-      <w:r>
-        <w:t>Task 2 – Fixating multiple targets one-by-one at different locations on a gray background</w:t>
-      </w:r>
-    </w:p>
-    <w:p>
-      <w:r>
-        <w:t>The participant is asked to place the head in the chinrest and to keep the head as still as possible during the recording. The head/chinrest position is adjusted such that the whole stimulus is visible in the scene camera of the eye tracker.</w:t>
-      </w:r>
-      <w:r>
-        <w:t xml:space="preserve"> If it is not possible to have the whole stimulus visible in the scene camera, the participant is positioned such that the center target is approximately in the center of the scene camera’s image.</w:t>
-      </w:r>
-    </w:p>
-    <w:p>
-      <w:r>
-        <w:lastRenderedPageBreak/>
-        <w:t>Fixation targets are then presented one at the time in random order</w:t>
-      </w:r>
-      <w:r>
-        <w:t>. To help participants locate the next target, fixation targets are moved smoothly between locations, and the next target location is cued with a red circle.</w:t>
-      </w:r>
-      <w:r>
-        <w:t xml:space="preserve"> Participants are instructed as follows:</w:t>
-      </w:r>
-    </w:p>
-    <w:p>
-      <w:r>
-        <w:t>“</w:t>
+        <w:t>A black-and-white fixation target will appear in the center of the screen. Carefully look at its center all the time. After a while, it will start moving. Once it starts moving, follow the fixation target around, and keep carefully looking at its center all the time.</w:t>
       </w:r>
       <w:r>
         <w:rPr>
           <w:i/>
           <w:iCs/>
         </w:rPr>
-        <w:t xml:space="preserve">A black-and-white fixation target will appear in the center of the screen. Carefully look at its center all the time. After a while, it will start moving. Once it starts moving, follow the fixation target around, and keep carefully looking at its center all the </w:t>
-      </w:r>
-      <w:proofErr w:type="gramStart"/>
-      <w:r>
-        <w:rPr>
-          <w:i/>
-          <w:iCs/>
-        </w:rPr>
-        <w:t>time.</w:t>
-      </w:r>
-      <w:r>
-        <w:rPr>
-          <w:i/>
-          <w:iCs/>
-        </w:rPr>
         <w:t>”</w:t>
       </w:r>
-      <w:proofErr w:type="gramEnd"/>
     </w:p>
     <w:p>
       <w:pPr>
@@ -2323,23 +2244,7 @@
           <w:i/>
           <w:iCs/>
         </w:rPr>
-        <w:t xml:space="preserve">A black-and-white fixation target will appear on top of a grey circle. Carefully </w:t>
-      </w:r>
-      <w:proofErr w:type="gramStart"/>
-      <w:r>
-        <w:rPr>
-          <w:i/>
-          <w:iCs/>
-        </w:rPr>
-        <w:t>look at the center of this target at all times</w:t>
-      </w:r>
-      <w:proofErr w:type="gramEnd"/>
-      <w:r>
-        <w:rPr>
-          <w:i/>
-          <w:iCs/>
-        </w:rPr>
-        <w:t>.</w:t>
+        <w:t>A black-and-white fixation target will appear on top of a grey circle. Carefully look at the center of this target at all times.</w:t>
       </w:r>
       <w:r>
         <w:t>”</w:t>
@@ -2633,9 +2538,8 @@
           <w:iCs w:val="0"/>
           <w:color w:val="000000" w:themeColor="text1"/>
         </w:rPr>
-        <w:t xml:space="preserve">median distance between gaze position data recorded 200 </w:t>
-      </w:r>
-      <w:proofErr w:type="spellStart"/>
+        <w:t xml:space="preserve">median distance between gaze position data recorded 200 ms before the offset of the dark and bright stimuli. This gives the pupil enough time to dilate and constrict </w:t>
+      </w:r>
       <w:r>
         <w:rPr>
           <w:rStyle w:val="Heading4Char"/>
@@ -2643,9 +2547,8 @@
           <w:iCs w:val="0"/>
           <w:color w:val="000000" w:themeColor="text1"/>
         </w:rPr>
-        <w:t>ms</w:t>
-      </w:r>
-      <w:proofErr w:type="spellEnd"/>
+        <w:t xml:space="preserve">prior to estimating the gaze position. </w:t>
+      </w:r>
       <w:r>
         <w:rPr>
           <w:rStyle w:val="Heading4Char"/>
@@ -2653,7 +2556,7 @@
           <w:iCs w:val="0"/>
           <w:color w:val="000000" w:themeColor="text1"/>
         </w:rPr>
-        <w:t xml:space="preserve"> before the offset of the dark and bright stimuli. This gives the pupil enough time to dilate and constrict </w:t>
+        <w:t>The</w:t>
       </w:r>
       <w:r>
         <w:rPr>
@@ -2662,7 +2565,7 @@
           <w:iCs w:val="0"/>
           <w:color w:val="000000" w:themeColor="text1"/>
         </w:rPr>
-        <w:t xml:space="preserve">prior to estimating the gaze position. </w:t>
+        <w:t xml:space="preserve"> </w:t>
       </w:r>
       <w:r>
         <w:rPr>
@@ -2671,7 +2574,7 @@
           <w:iCs w:val="0"/>
           <w:color w:val="000000" w:themeColor="text1"/>
         </w:rPr>
-        <w:t>The</w:t>
+        <w:t xml:space="preserve">mean </w:t>
       </w:r>
       <w:r>
         <w:rPr>
@@ -2680,9 +2583,8 @@
           <w:iCs w:val="0"/>
           <w:color w:val="000000" w:themeColor="text1"/>
         </w:rPr>
-        <w:t xml:space="preserve"> </w:t>
-      </w:r>
-      <w:proofErr w:type="gramStart"/>
+        <w:t>of the six consecutive</w:t>
+      </w:r>
       <w:r>
         <w:rPr>
           <w:rStyle w:val="Heading4Char"/>
@@ -2690,9 +2592,8 @@
           <w:iCs w:val="0"/>
           <w:color w:val="000000" w:themeColor="text1"/>
         </w:rPr>
-        <w:t>mean</w:t>
-      </w:r>
-      <w:proofErr w:type="gramEnd"/>
+        <w:t xml:space="preserve"> dark/bright distances </w:t>
+      </w:r>
       <w:r>
         <w:rPr>
           <w:rStyle w:val="Heading4Char"/>
@@ -2700,7 +2601,7 @@
           <w:iCs w:val="0"/>
           <w:color w:val="000000" w:themeColor="text1"/>
         </w:rPr>
-        <w:t xml:space="preserve"> </w:t>
+        <w:t>are</w:t>
       </w:r>
       <w:r>
         <w:rPr>
@@ -2709,33 +2610,6 @@
           <w:iCs w:val="0"/>
           <w:color w:val="000000" w:themeColor="text1"/>
         </w:rPr>
-        <w:t>of the six consecutive</w:t>
-      </w:r>
-      <w:r>
-        <w:rPr>
-          <w:rStyle w:val="Heading4Char"/>
-          <w:i w:val="0"/>
-          <w:iCs w:val="0"/>
-          <w:color w:val="000000" w:themeColor="text1"/>
-        </w:rPr>
-        <w:t xml:space="preserve"> dark/bright distances </w:t>
-      </w:r>
-      <w:r>
-        <w:rPr>
-          <w:rStyle w:val="Heading4Char"/>
-          <w:i w:val="0"/>
-          <w:iCs w:val="0"/>
-          <w:color w:val="000000" w:themeColor="text1"/>
-        </w:rPr>
-        <w:t>are</w:t>
-      </w:r>
-      <w:r>
-        <w:rPr>
-          <w:rStyle w:val="Heading4Char"/>
-          <w:i w:val="0"/>
-          <w:iCs w:val="0"/>
-          <w:color w:val="000000" w:themeColor="text1"/>
-        </w:rPr>
         <w:t xml:space="preserve"> used to compute the average gaze shift due to the PSA.</w:t>
       </w:r>
     </w:p>
@@ -2764,23 +2638,7 @@
         <w:t xml:space="preserve">&amp; Nyström, M. (2025). </w:t>
       </w:r>
       <w:r>
-        <w:t xml:space="preserve">Eye tracker calibration: How well can humans </w:t>
-      </w:r>
-      <w:proofErr w:type="spellStart"/>
-      <w:r>
-        <w:t>refixate</w:t>
-      </w:r>
-      <w:proofErr w:type="spellEnd"/>
-      <w:r>
-        <w:t xml:space="preserve"> a </w:t>
-      </w:r>
-      <w:proofErr w:type="gramStart"/>
-      <w:r>
-        <w:t>target?.</w:t>
-      </w:r>
-      <w:proofErr w:type="gramEnd"/>
-      <w:r>
-        <w:t> </w:t>
+        <w:t>Eye tracker calibration: How well can humans refixate a target?. </w:t>
       </w:r>
       <w:r>
         <w:rPr>
@@ -2904,17 +2762,8 @@
           <w:i/>
           <w:iCs/>
         </w:rPr>
-        <w:t xml:space="preserve">Acta </w:t>
-      </w:r>
-      <w:proofErr w:type="spellStart"/>
-      <w:r>
-        <w:rPr>
-          <w:i/>
-          <w:iCs/>
-        </w:rPr>
-        <w:t>Ophthalmologica</w:t>
-      </w:r>
-      <w:proofErr w:type="spellEnd"/>
+        <w:t>Acta Ophthalmologica</w:t>
+      </w:r>
       <w:r>
         <w:t>, </w:t>
       </w:r>

</xml_diff>